<commit_message>
feat: extend operation-scope access and fix legacy import delete cleanup
Add chat, attendance, and student-case operation policy services, route guards, and tests; strengthen session enforcement and auth caching. Fix legacy timesheet import delete to recover orphan work sessions through Mongo-aware maintenance entry updates, avoid hours validation on corrupt activity rows, and clear stale activity hour summaries after cleanup.

Co-authored-by: Cursor <cursoragent@cursor.com>
</commit_message>
<xml_diff>
--- a/docs/chat-operation-scope-capabilities-2026-09-03.docx
+++ b/docs/chat-operation-scope-capabilities-2026-09-03.docx
@@ -49,7 +49,23 @@
           <w:color w:val="1F4D78"/>
           <w:sz w:val="20"/>
         </w:rPr>
-        <w:t>This matrix describes the effective Chat behavior after central access approval. Every action is rechecked against the target conversation, current active memberships, and current package-role assignments.</w:t>
+        <w:t xml:space="preserve">This matrix describes </w:t>
+      </w:r>
+      <w:proofErr w:type="gramStart"/>
+      <w:r>
+        <w:rPr>
+          <w:color w:val="1F4D78"/>
+          <w:sz w:val="20"/>
+        </w:rPr>
+        <w:t>the effective</w:t>
+      </w:r>
+      <w:proofErr w:type="gramEnd"/>
+      <w:r>
+        <w:rPr>
+          <w:color w:val="1F4D78"/>
+          <w:sz w:val="20"/>
+        </w:rPr>
+        <w:t xml:space="preserve"> Chat behavior after central access approval. Every action is rechecked against the target conversation, current active memberships, and current package-role assignments.</w:t>
       </w:r>
     </w:p>
     <w:p>
@@ -966,12 +982,21 @@
               </w:rPr>
               <w:t>c</w:t>
             </w:r>
+            <w:proofErr w:type="spellStart"/>
             <w:r>
               <w:rPr>
                 <w:sz w:val="20"/>
                 <w:lang w:val="en-CA"/>
               </w:rPr>
-              <w:t>hecks are skipped for them</w:t>
+              <w:t>hecks</w:t>
+            </w:r>
+            <w:proofErr w:type="spellEnd"/>
+            <w:r>
+              <w:rPr>
+                <w:sz w:val="20"/>
+                <w:lang w:val="en-CA"/>
+              </w:rPr>
+              <w:t xml:space="preserve"> are skipped for them</w:t>
             </w:r>
             <w:r>
               <w:rPr>
@@ -1597,7 +1622,21 @@
               <w:rPr>
                 <w:sz w:val="20"/>
               </w:rPr>
-              <w:t>, reply previews, and active attachments in those conversations.</w:t>
+              <w:t xml:space="preserve">, </w:t>
+            </w:r>
+            <w:proofErr w:type="gramStart"/>
+            <w:r>
+              <w:rPr>
+                <w:sz w:val="20"/>
+              </w:rPr>
+              <w:t>reply</w:t>
+            </w:r>
+            <w:proofErr w:type="gramEnd"/>
+            <w:r>
+              <w:rPr>
+                <w:sz w:val="20"/>
+              </w:rPr>
+              <w:t xml:space="preserve"> previews, and active attachments in those conversations.</w:t>
             </w:r>
           </w:p>
           <w:p>
@@ -1874,7 +1913,21 @@
                 <w:sz w:val="20"/>
               </w:rPr>
               <w:br/>
-              <w:t>- to see the messaging history, message texts, reply previews, and active attachments in those conversations.</w:t>
+              <w:t xml:space="preserve">- to see the messaging history, message texts, </w:t>
+            </w:r>
+            <w:proofErr w:type="gramStart"/>
+            <w:r>
+              <w:rPr>
+                <w:sz w:val="20"/>
+              </w:rPr>
+              <w:t>reply</w:t>
+            </w:r>
+            <w:proofErr w:type="gramEnd"/>
+            <w:r>
+              <w:rPr>
+                <w:sz w:val="20"/>
+              </w:rPr>
+              <w:t xml:space="preserve"> previews, and active attachments in those conversations.</w:t>
             </w:r>
           </w:p>
           <w:p>
@@ -2139,7 +2192,21 @@
                 <w:sz w:val="20"/>
               </w:rPr>
               <w:br/>
-              <w:t>- to see the messaging history, message texts, reply previews, and active attachments in those conversations.</w:t>
+              <w:t xml:space="preserve">- to see the messaging history, message texts, </w:t>
+            </w:r>
+            <w:proofErr w:type="gramStart"/>
+            <w:r>
+              <w:rPr>
+                <w:sz w:val="20"/>
+              </w:rPr>
+              <w:t>reply</w:t>
+            </w:r>
+            <w:proofErr w:type="gramEnd"/>
+            <w:r>
+              <w:rPr>
+                <w:sz w:val="20"/>
+              </w:rPr>
+              <w:t xml:space="preserve"> previews, and active attachments in those conversations.</w:t>
             </w:r>
           </w:p>
           <w:p>
@@ -2482,7 +2549,23 @@
                 <w:sz w:val="20"/>
                 <w:lang w:val="en-CA"/>
               </w:rPr>
-              <w:t>Users with the appropriate permissions can view the complete message history of conversations in which they are participants. This includes message content, reply previews, and active attachments associated with those conversations.</w:t>
+              <w:t xml:space="preserve">Users with the appropriate permissions can view the complete message history of conversations in which they are participants. This includes message content, </w:t>
+            </w:r>
+            <w:proofErr w:type="gramStart"/>
+            <w:r>
+              <w:rPr>
+                <w:sz w:val="20"/>
+                <w:lang w:val="en-CA"/>
+              </w:rPr>
+              <w:t>reply</w:t>
+            </w:r>
+            <w:proofErr w:type="gramEnd"/>
+            <w:r>
+              <w:rPr>
+                <w:sz w:val="20"/>
+                <w:lang w:val="en-CA"/>
+              </w:rPr>
+              <w:t xml:space="preserve"> previews, and active attachments associated with those conversations.</w:t>
             </w:r>
           </w:p>
           <w:p>
@@ -2790,7 +2873,23 @@
                 <w:sz w:val="20"/>
                 <w:lang w:val="en-CA"/>
               </w:rPr>
-              <w:t>Users with the appropriate permissions can view the complete message history of conversations in which they are participants. This includes message content, reply previews, and active attachments associated with those conversations.</w:t>
+              <w:t xml:space="preserve">Users with the appropriate permissions can view the complete message history of conversations in which they are participants. This includes message content, </w:t>
+            </w:r>
+            <w:proofErr w:type="gramStart"/>
+            <w:r>
+              <w:rPr>
+                <w:sz w:val="20"/>
+                <w:lang w:val="en-CA"/>
+              </w:rPr>
+              <w:t>reply</w:t>
+            </w:r>
+            <w:proofErr w:type="gramEnd"/>
+            <w:r>
+              <w:rPr>
+                <w:sz w:val="20"/>
+                <w:lang w:val="en-CA"/>
+              </w:rPr>
+              <w:t xml:space="preserve"> previews, and active attachments associated with those conversations.</w:t>
             </w:r>
           </w:p>
         </w:tc>
@@ -2904,7 +3003,21 @@
               <w:rPr>
                 <w:sz w:val="20"/>
               </w:rPr>
-              <w:t>of all users within the packages that user has active roles.</w:t>
+              <w:t xml:space="preserve">of all users within the </w:t>
+            </w:r>
+            <w:proofErr w:type="gramStart"/>
+            <w:r>
+              <w:rPr>
+                <w:sz w:val="20"/>
+              </w:rPr>
+              <w:t>packages</w:t>
+            </w:r>
+            <w:proofErr w:type="gramEnd"/>
+            <w:r>
+              <w:rPr>
+                <w:sz w:val="20"/>
+              </w:rPr>
+              <w:t xml:space="preserve"> that user has active roles.</w:t>
             </w:r>
           </w:p>
         </w:tc>
@@ -3040,7 +3153,23 @@
                 <w:sz w:val="20"/>
                 <w:lang w:val="en-CA"/>
               </w:rPr>
-              <w:t>Users with the appropriate permissions can view the complete message history of conversations in which they are participants. This includes message content, reply previews, and active attachments associated with those conversations.</w:t>
+              <w:t xml:space="preserve">Users with the appropriate permissions can view the complete message history of conversations in which they are participants. This includes message content, </w:t>
+            </w:r>
+            <w:proofErr w:type="gramStart"/>
+            <w:r>
+              <w:rPr>
+                <w:sz w:val="20"/>
+                <w:lang w:val="en-CA"/>
+              </w:rPr>
+              <w:t>reply</w:t>
+            </w:r>
+            <w:proofErr w:type="gramEnd"/>
+            <w:r>
+              <w:rPr>
+                <w:sz w:val="20"/>
+                <w:lang w:val="en-CA"/>
+              </w:rPr>
+              <w:t xml:space="preserve"> previews, and active attachments associated with those conversations.</w:t>
             </w:r>
           </w:p>
           <w:p>
@@ -3884,7 +4013,23 @@
                 <w:bCs/>
                 <w:sz w:val="20"/>
               </w:rPr>
-              <w:t xml:space="preserve">Users with this access can only see the other contacts, search among them, pick and create a conversation. If the selected contact is already in a conversation in the conversations list, system does not allow creating a new one and opening the current one. Users can not see the list of conversations they have already in the chat modal with this </w:t>
+              <w:t xml:space="preserve">Users with this access can only see the other contacts, search among them, pick and create a conversation. If the selected contact is already in a conversation in the conversations list, system does not allow creating a new one and opening the current one. Users </w:t>
+            </w:r>
+            <w:proofErr w:type="spellStart"/>
+            <w:r>
+              <w:rPr>
+                <w:bCs/>
+                <w:sz w:val="20"/>
+              </w:rPr>
+              <w:t>can not</w:t>
+            </w:r>
+            <w:proofErr w:type="spellEnd"/>
+            <w:r>
+              <w:rPr>
+                <w:bCs/>
+                <w:sz w:val="20"/>
+              </w:rPr>
+              <w:t xml:space="preserve"> see the list of conversations they have already in the chat modal with this </w:t>
             </w:r>
             <w:r>
               <w:rPr>
@@ -5075,12 +5220,14 @@
               </w:rPr>
               <w:t xml:space="preserve">Can view inline images or download files only when DOWNLOAD_FILE is granted and the user can read the conversation. The message must be active and still reference the file. A deleted message's file cannot be downloaded, even </w:t>
             </w:r>
+            <w:proofErr w:type="gramStart"/>
             <w:r>
               <w:rPr>
                 <w:sz w:val="20"/>
               </w:rPr>
               <w:t>though</w:t>
             </w:r>
+            <w:proofErr w:type="gramEnd"/>
             <w:r>
               <w:rPr>
                 <w:sz w:val="20"/>
@@ -5561,13 +5708,7 @@
               <w:rPr>
                 <w:sz w:val="20"/>
               </w:rPr>
-              <w:t xml:space="preserve"> </w:t>
-            </w:r>
-            <w:r>
-              <w:rPr>
-                <w:sz w:val="20"/>
-              </w:rPr>
-              <w:t>Deleted messages are only from their side and the other side can still see the messages.</w:t>
+              <w:t xml:space="preserve"> Deleted messages are only from their side and the other side can still see the messages.</w:t>
             </w:r>
           </w:p>
         </w:tc>
@@ -5800,13 +5941,7 @@
               <w:rPr>
                 <w:sz w:val="20"/>
               </w:rPr>
-              <w:t xml:space="preserve">Can delete either participant's messages, including mixed multi-select, only in conversations where the user is participant. Deleted messages </w:t>
-            </w:r>
-            <w:r>
-              <w:rPr>
-                <w:sz w:val="20"/>
-              </w:rPr>
-              <w:t>delete the message for both sides of the conversation.</w:t>
+              <w:t>Can delete either participant's messages, including mixed multi-select, only in conversations where the user is participant. Deleted messages delete the message for both sides of the conversation.</w:t>
             </w:r>
           </w:p>
         </w:tc>
@@ -6168,9 +6303,13 @@
         </w:tc>
       </w:tr>
       <w:tr>
+        <w:trPr>
+          <w:trHeight w:val="208"/>
+        </w:trPr>
         <w:tc>
           <w:tcPr>
             <w:tcW w:w="1440" w:type="dxa"/>
+            <w:vMerge w:val="restart"/>
             <w:tcMar>
               <w:top w:w="80" w:type="dxa"/>
               <w:left w:w="120" w:type="dxa"/>
@@ -6196,6 +6335,7 @@
         <w:tc>
           <w:tcPr>
             <w:tcW w:w="1656" w:type="dxa"/>
+            <w:vMerge w:val="restart"/>
             <w:tcMar>
               <w:top w:w="80" w:type="dxa"/>
               <w:left w:w="120" w:type="dxa"/>
@@ -6217,14 +6357,7 @@
                 <w:b/>
                 <w:sz w:val="20"/>
               </w:rPr>
-              <w:t>ORGANIZATION</w:t>
-            </w:r>
-            <w:r>
-              <w:rPr>
-                <w:b/>
-                <w:sz w:val="20"/>
-              </w:rPr>
-              <w:t>/</w:t>
+              <w:t>ORGANIZATION/</w:t>
             </w:r>
           </w:p>
           <w:p>
@@ -6256,19 +6389,137 @@
               <w:spacing w:after="0" w:line="269" w:lineRule="auto"/>
               <w:rPr>
                 <w:sz w:val="20"/>
-              </w:rPr>
-            </w:pPr>
-            <w:r>
-              <w:rPr>
-                <w:sz w:val="20"/>
-              </w:rPr>
-              <w:t>On ‘</w:t>
+                <w:lang w:val="en-CA"/>
+              </w:rPr>
+            </w:pPr>
+            <w:r>
+              <w:rPr>
+                <w:sz w:val="20"/>
+                <w:lang w:val="en-CA"/>
+              </w:rPr>
+              <w:t xml:space="preserve">On the </w:t>
+            </w:r>
+            <w:r>
+              <w:rPr>
+                <w:sz w:val="20"/>
+                <w:lang w:val="en-CA"/>
+              </w:rPr>
+              <w:t>‘</w:t>
             </w:r>
             <w:r>
               <w:rPr>
                 <w:b/>
                 <w:bCs/>
                 <w:sz w:val="20"/>
+                <w:lang w:val="en-CA"/>
+              </w:rPr>
+              <w:t>Chat</w:t>
+            </w:r>
+            <w:r>
+              <w:rPr>
+                <w:b/>
+                <w:bCs/>
+                <w:sz w:val="20"/>
+                <w:lang w:val="en-CA"/>
+              </w:rPr>
+              <w:t>’</w:t>
+            </w:r>
+            <w:r>
+              <w:rPr>
+                <w:sz w:val="20"/>
+                <w:lang w:val="en-CA"/>
+              </w:rPr>
+              <w:t xml:space="preserve"> modal:</w:t>
+            </w:r>
+          </w:p>
+          <w:p>
+            <w:pPr>
+              <w:spacing w:after="0" w:line="269" w:lineRule="auto"/>
+            </w:pPr>
+            <w:r>
+              <w:t>Users can delete the conversation for both sides.</w:t>
+            </w:r>
+          </w:p>
+        </w:tc>
+      </w:tr>
+      <w:tr>
+        <w:trPr>
+          <w:trHeight w:val="207"/>
+        </w:trPr>
+        <w:tc>
+          <w:tcPr>
+            <w:tcW w:w="1440" w:type="dxa"/>
+            <w:vMerge/>
+            <w:tcMar>
+              <w:top w:w="80" w:type="dxa"/>
+              <w:left w:w="120" w:type="dxa"/>
+              <w:bottom w:w="80" w:type="dxa"/>
+              <w:right w:w="120" w:type="dxa"/>
+            </w:tcMar>
+            <w:vAlign w:val="center"/>
+          </w:tcPr>
+          <w:p>
+            <w:pPr>
+              <w:spacing w:after="0" w:line="269" w:lineRule="auto"/>
+              <w:rPr>
+                <w:b/>
+                <w:color w:val="1F4D78"/>
+                <w:sz w:val="20"/>
+              </w:rPr>
+            </w:pPr>
+          </w:p>
+        </w:tc>
+        <w:tc>
+          <w:tcPr>
+            <w:tcW w:w="1656" w:type="dxa"/>
+            <w:vMerge/>
+            <w:tcMar>
+              <w:top w:w="80" w:type="dxa"/>
+              <w:left w:w="120" w:type="dxa"/>
+              <w:bottom w:w="80" w:type="dxa"/>
+              <w:right w:w="120" w:type="dxa"/>
+            </w:tcMar>
+            <w:vAlign w:val="center"/>
+          </w:tcPr>
+          <w:p>
+            <w:pPr>
+              <w:spacing w:after="0" w:line="269" w:lineRule="auto"/>
+              <w:rPr>
+                <w:b/>
+                <w:sz w:val="20"/>
+              </w:rPr>
+            </w:pPr>
+          </w:p>
+        </w:tc>
+        <w:tc>
+          <w:tcPr>
+            <w:tcW w:w="6264" w:type="dxa"/>
+            <w:tcMar>
+              <w:top w:w="80" w:type="dxa"/>
+              <w:left w:w="120" w:type="dxa"/>
+              <w:bottom w:w="80" w:type="dxa"/>
+              <w:right w:w="120" w:type="dxa"/>
+            </w:tcMar>
+            <w:vAlign w:val="center"/>
+          </w:tcPr>
+          <w:p>
+            <w:pPr>
+              <w:spacing w:after="0" w:line="269" w:lineRule="auto"/>
+              <w:rPr>
+                <w:sz w:val="20"/>
+              </w:rPr>
+            </w:pPr>
+            <w:r>
+              <w:rPr>
+                <w:sz w:val="20"/>
+              </w:rPr>
+              <w:t>On ‘</w:t>
+            </w:r>
+            <w:r>
+              <w:rPr>
+                <w:b/>
+                <w:bCs/>
+                <w:sz w:val="20"/>
               </w:rPr>
               <w:t>Conversation Management</w:t>
             </w:r>
@@ -6282,20 +6533,16 @@
           <w:p>
             <w:pPr>
               <w:spacing w:after="0" w:line="269" w:lineRule="auto"/>
+              <w:rPr>
+                <w:sz w:val="20"/>
+              </w:rPr>
             </w:pPr>
             <w:r>
               <w:rPr>
                 <w:sz w:val="20"/>
                 <w:lang w:val="en-CA"/>
               </w:rPr>
-              <w:t>Can delete any conversation</w:t>
-            </w:r>
-            <w:r>
-              <w:rPr>
-                <w:sz w:val="20"/>
-                <w:lang w:val="en-CA"/>
-              </w:rPr>
-              <w:t>.</w:t>
+              <w:t>Can delete any conversation.</w:t>
             </w:r>
           </w:p>
         </w:tc>
@@ -7479,7 +7726,7 @@
   <w:style w:type="paragraph" w:default="1" w:styleId="Normal">
     <w:name w:val="Normal"/>
     <w:qFormat/>
-    <w:rsid w:val="002E6AFE"/>
+    <w:rsid w:val="004E505B"/>
     <w:pPr>
       <w:spacing w:after="120" w:line="300" w:lineRule="auto"/>
     </w:pPr>

</xml_diff>